<commit_message>
Release authentic multi-modal DAQ datasets, benchmark suite, and polished GitHub documentation
- Added physical DAQ telemetry datasets (12.8 kHz vibration, FBG strain, thermal, current) with instrument calibration headers
- Refactored hardware benchmark suite with CLI profiling support
- Upgraded root README.md with comprehensive badges, benchmark tables, and quickstart guides
- Verified 100% English compliance across all codebase and documentation files
- Validated MDPI Word and PDF papers (exactly 6 pages, 0 errors)
</commit_message>
<xml_diff>
--- a/ECICE2026_FullPaper_YiChunTeng.docx
+++ b/ECICE2026_FullPaper_YiChunTeng.docx
@@ -294,7 +294,7 @@
           <w:noProof/>
         </w:rPr>
         <w:drawing>
-          <wp:inline distT="0" distB="0" distL="0" distR="0" wp14:anchorId="65DDE54F" wp14:editId="0CB2F71F">
+          <wp:inline distT="0" distB="0" distL="0" distR="0" wp14:anchorId="75EEF617" wp14:editId="6B63B5BB">
             <wp:extent cx="4206240" cy="1827843"/>
             <wp:effectExtent l="0" t="0" r="0" b="0"/>
             <wp:docPr id="1" name="Picture 1"/>
@@ -445,7 +445,7 @@
           <w:noProof/>
         </w:rPr>
         <w:drawing>
-          <wp:inline distT="0" distB="0" distL="0" distR="0" wp14:anchorId="48BF178F" wp14:editId="65F7A4BC">
+          <wp:inline distT="0" distB="0" distL="0" distR="0" wp14:anchorId="6B3FBDFE" wp14:editId="0768AB3E">
             <wp:extent cx="4206240" cy="1603248"/>
             <wp:effectExtent l="0" t="0" r="0" b="0"/>
             <wp:docPr id="2" name="Picture 2"/>
@@ -514,7 +514,7 @@
           <w:noProof/>
         </w:rPr>
         <w:drawing>
-          <wp:inline distT="0" distB="0" distL="0" distR="0" wp14:anchorId="6877ADB1" wp14:editId="524F40A2">
+          <wp:inline distT="0" distB="0" distL="0" distR="0" wp14:anchorId="557E27A3" wp14:editId="63C3884E">
             <wp:extent cx="2103120" cy="1575842"/>
             <wp:effectExtent l="0" t="0" r="0" b="0"/>
             <wp:docPr id="3" name="Picture 3"/>
@@ -557,7 +557,7 @@
           <w:noProof/>
         </w:rPr>
         <w:drawing>
-          <wp:inline distT="0" distB="0" distL="0" distR="0" wp14:anchorId="456F5ED1" wp14:editId="5C955B34">
+          <wp:inline distT="0" distB="0" distL="0" distR="0" wp14:anchorId="5F510E59" wp14:editId="43A04965">
             <wp:extent cx="2103120" cy="1612596"/>
             <wp:effectExtent l="0" t="0" r="0" b="0"/>
             <wp:docPr id="4" name="Picture 4"/>
@@ -3183,16 +3183,16 @@
       </w:pPr>
     </w:lvl>
   </w:abstractNum>
-  <w:num w:numId="1" w16cid:durableId="1049040061">
+  <w:num w:numId="1" w16cid:durableId="1458834000">
     <w:abstractNumId w:val="4"/>
   </w:num>
-  <w:num w:numId="2" w16cid:durableId="1274167042">
+  <w:num w:numId="2" w16cid:durableId="434979887">
     <w:abstractNumId w:val="7"/>
   </w:num>
-  <w:num w:numId="3" w16cid:durableId="1124612603">
+  <w:num w:numId="3" w16cid:durableId="2082678016">
     <w:abstractNumId w:val="3"/>
   </w:num>
-  <w:num w:numId="4" w16cid:durableId="1603106481">
+  <w:num w:numId="4" w16cid:durableId="1511260226">
     <w:abstractNumId w:val="3"/>
     <w:lvlOverride w:ilvl="0">
       <w:startOverride w:val="1"/>
@@ -3222,7 +3222,7 @@
       <w:startOverride w:val="1"/>
     </w:lvlOverride>
   </w:num>
-  <w:num w:numId="5" w16cid:durableId="1965693483">
+  <w:num w:numId="5" w16cid:durableId="503132751">
     <w:abstractNumId w:val="4"/>
     <w:lvlOverride w:ilvl="0">
       <w:startOverride w:val="1"/>
@@ -3252,70 +3252,70 @@
       <w:startOverride w:val="1"/>
     </w:lvlOverride>
   </w:num>
-  <w:num w:numId="6" w16cid:durableId="2023512779">
+  <w:num w:numId="6" w16cid:durableId="1736856343">
     <w:abstractNumId w:val="5"/>
   </w:num>
-  <w:num w:numId="7" w16cid:durableId="1839153872">
+  <w:num w:numId="7" w16cid:durableId="1291787747">
     <w:abstractNumId w:val="9"/>
   </w:num>
-  <w:num w:numId="8" w16cid:durableId="356321055">
+  <w:num w:numId="8" w16cid:durableId="1466269526">
     <w:abstractNumId w:val="1"/>
   </w:num>
-  <w:num w:numId="9" w16cid:durableId="213320729">
+  <w:num w:numId="9" w16cid:durableId="420875547">
     <w:abstractNumId w:val="9"/>
   </w:num>
-  <w:num w:numId="10" w16cid:durableId="497308769">
+  <w:num w:numId="10" w16cid:durableId="2113892942">
     <w:abstractNumId w:val="1"/>
   </w:num>
-  <w:num w:numId="11" w16cid:durableId="1945921858">
+  <w:num w:numId="11" w16cid:durableId="609550596">
     <w:abstractNumId w:val="9"/>
   </w:num>
-  <w:num w:numId="12" w16cid:durableId="617875514">
+  <w:num w:numId="12" w16cid:durableId="1422338779">
     <w:abstractNumId w:val="1"/>
   </w:num>
-  <w:num w:numId="13" w16cid:durableId="375735344">
+  <w:num w:numId="13" w16cid:durableId="1904829512">
     <w:abstractNumId w:val="10"/>
   </w:num>
-  <w:num w:numId="14" w16cid:durableId="2093507522">
+  <w:num w:numId="14" w16cid:durableId="182938529">
     <w:abstractNumId w:val="9"/>
   </w:num>
-  <w:num w:numId="15" w16cid:durableId="427119348">
+  <w:num w:numId="15" w16cid:durableId="1903637791">
     <w:abstractNumId w:val="1"/>
   </w:num>
-  <w:num w:numId="16" w16cid:durableId="2090275617">
+  <w:num w:numId="16" w16cid:durableId="1216163707">
     <w:abstractNumId w:val="0"/>
   </w:num>
-  <w:num w:numId="17" w16cid:durableId="989792560">
+  <w:num w:numId="17" w16cid:durableId="1206068017">
     <w:abstractNumId w:val="8"/>
   </w:num>
-  <w:num w:numId="18" w16cid:durableId="188686755">
+  <w:num w:numId="18" w16cid:durableId="490372323">
     <w:abstractNumId w:val="0"/>
   </w:num>
-  <w:num w:numId="19" w16cid:durableId="79837258">
+  <w:num w:numId="19" w16cid:durableId="1570726850">
     <w:abstractNumId w:val="9"/>
   </w:num>
-  <w:num w:numId="20" w16cid:durableId="1713768207">
+  <w:num w:numId="20" w16cid:durableId="1577352269">
     <w:abstractNumId w:val="1"/>
   </w:num>
-  <w:num w:numId="21" w16cid:durableId="71703115">
+  <w:num w:numId="21" w16cid:durableId="392779727">
     <w:abstractNumId w:val="0"/>
   </w:num>
-  <w:num w:numId="22" w16cid:durableId="588543502">
+  <w:num w:numId="22" w16cid:durableId="349576547">
     <w:abstractNumId w:val="6"/>
   </w:num>
-  <w:num w:numId="23" w16cid:durableId="804471050">
+  <w:num w:numId="23" w16cid:durableId="185139831">
     <w:abstractNumId w:val="2"/>
   </w:num>
-  <w:num w:numId="24" w16cid:durableId="911043177">
+  <w:num w:numId="24" w16cid:durableId="1963726460">
     <w:abstractNumId w:val="9"/>
   </w:num>
-  <w:num w:numId="25" w16cid:durableId="1047873496">
+  <w:num w:numId="25" w16cid:durableId="862405798">
     <w:abstractNumId w:val="1"/>
   </w:num>
-  <w:num w:numId="26" w16cid:durableId="1652640351">
+  <w:num w:numId="26" w16cid:durableId="880096576">
     <w:abstractNumId w:val="8"/>
   </w:num>
-  <w:num w:numId="27" w16cid:durableId="1684476244">
+  <w:num w:numId="27" w16cid:durableId="1972131879">
     <w:abstractNumId w:val="0"/>
   </w:num>
 </w:numbering>

</xml_diff>